<commit_message>
feat: 集成 MCP Server + 合并约束文件
- 集成 KB Vault MCP Server (12 个工具, 8 个 Runtime 钩子)
- 合并约束文件 (SOP v1.5.7, 最小执行协议 v2.0)
- 添加 .kb/state/ 状态存储目录
- 添加 .claude/ 配置目录
- 添加 .mcp.json MCP 配置
- 添加 AGENTS.md Agent 执行规范

Phase A-E 全部完成, 27/27 测试通过。
</commit_message>
<xml_diff>
--- a/06-学生侧材料/讲义/2026-06-23-亲核取代与消除反应.docx
+++ b/06-学生侧材料/讲义/2026-06-23-亲核取代与消除反应.docx
@@ -2,7 +2,7 @@
 <file path=word/document.xml><?xml version="1.0" encoding="utf-8"?>
 <w:document xmlns:w="http://schemas.openxmlformats.org/wordprocessingml/2006/main" xmlns:m="http://schemas.openxmlformats.org/officeDocument/2006/math" xmlns:r="http://schemas.openxmlformats.org/officeDocument/2006/relationships" xmlns:o="urn:schemas-microsoft-com:office:office" xmlns:v="urn:schemas-microsoft-com:vml" xmlns:w10="urn:schemas-microsoft-com:office:word" xmlns:a="http://schemas.openxmlformats.org/drawingml/2006/main" xmlns:pic="http://schemas.openxmlformats.org/drawingml/2006/picture" xmlns:wp="http://schemas.openxmlformats.org/drawingml/2006/wordprocessingDrawing">
   <w:body>
-    <w:bookmarkStart w:id="50" w:name="第四讲亲核取代与消除反应"/>
+    <w:bookmarkStart w:id="53" w:name="第四讲亲核取代与消除反应"/>
     <w:p>
       <w:pPr>
         <w:pStyle w:val="Heading1"/>
@@ -451,7 +451,7 @@
           <w:p>
             <w:pPr>
               <w:pStyle w:val="Compact"/>
-              <w:jc w:val="left"/>
+              <w:jc w:val="center"/>
             </w:pPr>
             <w:r>
               <w:rPr>
@@ -467,7 +467,7 @@
           <w:p>
             <w:pPr>
               <w:pStyle w:val="Compact"/>
-              <w:jc w:val="left"/>
+              <w:jc w:val="center"/>
             </w:pPr>
             <w:r>
               <w:rPr>
@@ -490,7 +490,7 @@
           <w:p>
             <w:pPr>
               <w:pStyle w:val="Compact"/>
-              <w:jc w:val="left"/>
+              <w:jc w:val="center"/>
             </w:pPr>
             <w:r>
               <w:rPr>
@@ -515,7 +515,7 @@
           <w:p>
             <w:pPr>
               <w:pStyle w:val="Compact"/>
-              <w:jc w:val="left"/>
+              <w:jc w:val="center"/>
             </w:pPr>
             <w:r>
               <w:rPr>
@@ -532,7 +532,7 @@
           <w:p>
             <w:pPr>
               <w:pStyle w:val="Compact"/>
-              <w:jc w:val="left"/>
+              <w:jc w:val="center"/>
             </w:pPr>
             <w:r>
               <w:rPr>
@@ -553,7 +553,7 @@
           <w:p>
             <w:pPr>
               <w:pStyle w:val="Compact"/>
-              <w:jc w:val="left"/>
+              <w:jc w:val="center"/>
             </w:pPr>
             <w:r>
               <w:rPr>
@@ -576,7 +576,7 @@
           <w:p>
             <w:pPr>
               <w:pStyle w:val="Compact"/>
-              <w:jc w:val="left"/>
+              <w:jc w:val="center"/>
             </w:pPr>
             <w:r>
               <w:rPr>
@@ -593,7 +593,7 @@
           <w:p>
             <w:pPr>
               <w:pStyle w:val="Compact"/>
-              <w:jc w:val="left"/>
+              <w:jc w:val="center"/>
             </w:pPr>
             <w:r>
               <w:rPr>
@@ -608,7 +608,7 @@
           <w:p>
             <w:pPr>
               <w:pStyle w:val="Compact"/>
-              <w:jc w:val="left"/>
+              <w:jc w:val="center"/>
             </w:pPr>
             <w:r>
               <w:rPr>
@@ -720,7 +720,7 @@
           <w:p>
             <w:pPr>
               <w:pStyle w:val="Compact"/>
-              <w:jc w:val="left"/>
+              <w:jc w:val="center"/>
             </w:pPr>
             <w:r>
               <w:rPr>
@@ -736,7 +736,7 @@
           <w:p>
             <w:pPr>
               <w:pStyle w:val="Compact"/>
-              <w:jc w:val="left"/>
+              <w:jc w:val="center"/>
             </w:pPr>
             <w:r>
               <w:rPr>
@@ -769,7 +769,7 @@
           <w:p>
             <w:pPr>
               <w:pStyle w:val="Compact"/>
-              <w:jc w:val="left"/>
+              <w:jc w:val="center"/>
             </w:pPr>
             <w:r>
               <w:rPr>
@@ -786,7 +786,7 @@
           <w:p>
             <w:pPr>
               <w:pStyle w:val="Compact"/>
-              <w:jc w:val="left"/>
+              <w:jc w:val="center"/>
             </w:pPr>
             <w:r>
               <w:rPr>
@@ -818,7 +818,7 @@
           <w:p>
             <w:pPr>
               <w:pStyle w:val="Compact"/>
-              <w:jc w:val="left"/>
+              <w:jc w:val="center"/>
             </w:pPr>
             <w:r>
               <w:rPr>
@@ -835,7 +835,7 @@
           <w:p>
             <w:pPr>
               <w:pStyle w:val="Compact"/>
-              <w:jc w:val="left"/>
+              <w:jc w:val="center"/>
             </w:pPr>
             <w:r>
               <w:rPr>
@@ -891,7 +891,7 @@
           <w:p>
             <w:pPr>
               <w:pStyle w:val="Compact"/>
-              <w:jc w:val="left"/>
+              <w:jc w:val="center"/>
             </w:pPr>
             <w:r>
               <w:rPr>
@@ -908,7 +908,7 @@
           <w:p>
             <w:pPr>
               <w:pStyle w:val="Compact"/>
-              <w:jc w:val="left"/>
+              <w:jc w:val="center"/>
             </w:pPr>
             <w:r>
               <w:rPr>
@@ -952,7 +952,7 @@
           <w:p>
             <w:pPr>
               <w:pStyle w:val="Compact"/>
-              <w:jc w:val="left"/>
+              <w:jc w:val="center"/>
             </w:pPr>
             <w:r>
               <w:rPr>
@@ -969,7 +969,7 @@
           <w:p>
             <w:pPr>
               <w:pStyle w:val="Compact"/>
-              <w:jc w:val="left"/>
+              <w:jc w:val="center"/>
             </w:pPr>
             <w:r>
               <w:rPr>
@@ -1025,7 +1025,7 @@
           <w:p>
             <w:pPr>
               <w:pStyle w:val="Compact"/>
-              <w:jc w:val="left"/>
+              <w:jc w:val="center"/>
             </w:pPr>
             <w:r>
               <w:rPr>
@@ -1042,7 +1042,7 @@
           <w:p>
             <w:pPr>
               <w:pStyle w:val="Compact"/>
-              <w:jc w:val="left"/>
+              <w:jc w:val="center"/>
             </w:pPr>
             <w:r>
               <w:rPr>
@@ -1112,7 +1112,7 @@
     </w:p>
     <w:bookmarkEnd w:id="11"/>
     <w:bookmarkEnd w:id="12"/>
-    <w:bookmarkStart w:id="17" w:name="二sn2-与-sn1取代反应的协同与分步"/>
+    <w:bookmarkStart w:id="20" w:name="二sn2-与-sn1取代反应的协同与分步"/>
     <w:p>
       <w:pPr>
         <w:pStyle w:val="Heading2"/>
@@ -1142,7 +1142,7 @@
         <w:t xml:space="preserve">SN1：取代反应的协同与分步</w:t>
       </w:r>
     </w:p>
-    <w:bookmarkStart w:id="13" w:name="sn2双分子亲核取代一步协同"/>
+    <w:bookmarkStart w:id="16" w:name="sn2双分子亲核取代一步协同"/>
     <w:p>
       <w:pPr>
         <w:pStyle w:val="Heading3"/>
@@ -1160,6 +1160,143 @@
     <w:p>
       <w:pPr>
         <w:pStyle w:val="FirstParagraph"/>
+        <w:jc w:val="center"/>
+      </w:pPr>
+      <w:r>
+        <w:rPr>
+          <w:b w:val="0"/>
+          <w:i w:val="0"/>
+          <w:sz w:val="21"/>
+        </w:rPr>
+        <w:drawing>
+          <wp:inline>
+            <wp:extent cx="3419475" cy="714375"/>
+            <wp:effectExtent b="0" l="0" r="0" t="0"/>
+            <wp:docPr descr="SN2 反应示意图——背侧进攻与 Walden 翻转" title="" id="14" name="Picture"/>
+            <a:graphic>
+              <a:graphicData uri="http://schemas.openxmlformats.org/drawingml/2006/picture">
+                <pic:pic>
+                  <pic:nvPicPr>
+                    <pic:cNvPr descr="media/sn2-reaction.svg" id="15" name="Picture"/>
+                    <pic:cNvPicPr>
+                      <a:picLocks noChangeArrowheads="1" noChangeAspect="1"/>
+                    </pic:cNvPicPr>
+                  </pic:nvPicPr>
+                  <pic:blipFill>
+                    <a:blip>
+                      <a:extLst>
+                        <a:ext uri="{28A0092B-C50C-407E-A947-70E740481C1C}">
+                          <a14:useLocalDpi xmlns:a14="http://schemas.microsoft.com/office/drawing/2010/main" val="0"/>
+                        </a:ext>
+                        <a:ext uri="{96DAC541-7B7A-43D3-8B79-37D633B846F1}">
+                          <asvg:svgBlip xmlns:asvg="http://schemas.microsoft.com/office/drawing/2016/SVG/main" r:embed="rId13"/>
+                        </a:ext>
+                      </a:extLst>
+                    </a:blip>
+                    <a:stretch>
+                      <a:fillRect/>
+                    </a:stretch>
+                  </pic:blipFill>
+                  <pic:spPr bwMode="auto">
+                    <a:xfrm>
+                      <a:off x="0" y="0"/>
+                      <a:ext cx="3419475" cy="714375"/>
+                    </a:xfrm>
+                    <a:prstGeom prst="rect">
+                      <a:avLst/>
+                    </a:prstGeom>
+                    <a:noFill/>
+                    <a:ln w="9525">
+                      <a:noFill/>
+                      <a:headEnd/>
+                      <a:tailEnd/>
+                    </a:ln>
+                  </pic:spPr>
+                </pic:pic>
+              </a:graphicData>
+            </a:graphic>
+          </wp:inline>
+        </w:drawing>
+      </w:r>
+      <w:r>
+        <w:rPr>
+          <w:b w:val="0"/>
+          <w:i w:val="0"/>
+          <w:sz w:val="21"/>
+        </w:rPr>
+        <w:t xml:space="preserve"> </w:t>
+      </w:r>
+      <w:r>
+        <w:rPr>
+          <w:rFonts w:hint="eastAsia" w:eastAsia="FangSong" w:ascii="Times New Roman" w:hAnsi="Times New Roman"/>
+          <w:b w:val="0"/>
+          <w:i w:val="0"/>
+          <w:iCs/>
+          <w:sz w:val="21"/>
+        </w:rPr>
+        <w:t xml:space="preserve">图</w:t>
+      </w:r>
+      <w:r>
+        <w:rPr>
+          <w:b w:val="0"/>
+          <w:i w:val="0"/>
+          <w:iCs/>
+          <w:sz w:val="21"/>
+        </w:rPr>
+        <w:t xml:space="preserve"> SN2 </w:t>
+      </w:r>
+      <w:r>
+        <w:rPr>
+          <w:rFonts w:hint="eastAsia" w:eastAsia="FangSong" w:ascii="Times New Roman" w:hAnsi="Times New Roman"/>
+          <w:b w:val="0"/>
+          <w:i w:val="0"/>
+          <w:iCs/>
+          <w:sz w:val="21"/>
+        </w:rPr>
+        <w:t xml:space="preserve">反应的背侧进攻与</w:t>
+      </w:r>
+      <w:r>
+        <w:rPr>
+          <w:b w:val="0"/>
+          <w:i w:val="0"/>
+          <w:iCs/>
+          <w:sz w:val="21"/>
+        </w:rPr>
+        <w:t xml:space="preserve"> Walden </w:t>
+      </w:r>
+      <w:r>
+        <w:rPr>
+          <w:rFonts w:hint="eastAsia" w:eastAsia="FangSong" w:ascii="Times New Roman" w:hAnsi="Times New Roman"/>
+          <w:b w:val="0"/>
+          <w:i w:val="0"/>
+          <w:iCs/>
+          <w:sz w:val="21"/>
+        </w:rPr>
+        <w:t xml:space="preserve">翻转。亲核试剂从离去基的背面进攻碳原子，形成五配位过渡态后离去基离去，产物的构型完全翻转（Wikimedia</w:t>
+      </w:r>
+      <w:r>
+        <w:rPr>
+          <w:b w:val="0"/>
+          <w:i w:val="0"/>
+          <w:iCs/>
+          <w:sz w:val="21"/>
+        </w:rPr>
+        <w:t xml:space="preserve"> </w:t>
+      </w:r>
+      <w:r>
+        <w:rPr>
+          <w:rFonts w:hint="eastAsia" w:eastAsia="FangSong" w:ascii="Times New Roman" w:hAnsi="Times New Roman"/>
+          <w:b w:val="0"/>
+          <w:i w:val="0"/>
+          <w:iCs/>
+          <w:sz w:val="21"/>
+        </w:rPr>
+        <w:t xml:space="preserve">Commons）</w:t>
+      </w:r>
+    </w:p>
+    <w:p>
+      <w:pPr>
+        <w:pStyle w:val="BodyText"/>
       </w:pPr>
       <w:r>
         <w:rPr>
@@ -1519,7 +1656,7 @@
           <w:p>
             <w:pPr>
               <w:pStyle w:val="Compact"/>
-              <w:jc w:val="left"/>
+              <w:jc w:val="center"/>
             </w:pPr>
             <w:r>
               <w:rPr>
@@ -1535,7 +1672,7 @@
           <w:p>
             <w:pPr>
               <w:pStyle w:val="Compact"/>
-              <w:jc w:val="left"/>
+              <w:jc w:val="center"/>
             </w:pPr>
             <w:r>
               <w:rPr>
@@ -1551,7 +1688,7 @@
           <w:p>
             <w:pPr>
               <w:pStyle w:val="Compact"/>
-              <w:jc w:val="left"/>
+              <w:jc w:val="center"/>
             </w:pPr>
             <w:r>
               <w:rPr>
@@ -1569,7 +1706,7 @@
           <w:p>
             <w:pPr>
               <w:pStyle w:val="Compact"/>
-              <w:jc w:val="left"/>
+              <w:jc w:val="center"/>
             </w:pPr>
             <w:r>
               <w:rPr>
@@ -1584,7 +1721,7 @@
           <w:p>
             <w:pPr>
               <w:pStyle w:val="Compact"/>
-              <w:jc w:val="left"/>
+              <w:jc w:val="center"/>
             </w:pPr>
             <w:r>
               <w:rPr>
@@ -1605,7 +1742,7 @@
           <w:p>
             <w:pPr>
               <w:pStyle w:val="Compact"/>
-              <w:jc w:val="left"/>
+              <w:jc w:val="center"/>
             </w:pPr>
             <w:r>
               <w:rPr>
@@ -1622,7 +1759,7 @@
           <w:p>
             <w:pPr>
               <w:pStyle w:val="Compact"/>
-              <w:jc w:val="left"/>
+              <w:jc w:val="center"/>
             </w:pPr>
             <w:r>
               <w:rPr>
@@ -1637,7 +1774,7 @@
           <w:p>
             <w:pPr>
               <w:pStyle w:val="Compact"/>
-              <w:jc w:val="left"/>
+              <w:jc w:val="center"/>
             </w:pPr>
             <w:r>
               <w:rPr>
@@ -1664,7 +1801,7 @@
           <w:p>
             <w:pPr>
               <w:pStyle w:val="Compact"/>
-              <w:jc w:val="left"/>
+              <w:jc w:val="center"/>
             </w:pPr>
             <w:r>
               <w:rPr>
@@ -1681,7 +1818,7 @@
           <w:p>
             <w:pPr>
               <w:pStyle w:val="Compact"/>
-              <w:jc w:val="left"/>
+              <w:jc w:val="center"/>
             </w:pPr>
             <w:r>
               <w:rPr>
@@ -1696,7 +1833,7 @@
           <w:p>
             <w:pPr>
               <w:pStyle w:val="Compact"/>
-              <w:jc w:val="left"/>
+              <w:jc w:val="center"/>
             </w:pPr>
             <w:r>
               <w:rPr>
@@ -1743,7 +1880,7 @@
           <w:p>
             <w:pPr>
               <w:pStyle w:val="Compact"/>
-              <w:jc w:val="left"/>
+              <w:jc w:val="center"/>
             </w:pPr>
             <w:r>
               <w:rPr>
@@ -1760,7 +1897,7 @@
           <w:p>
             <w:pPr>
               <w:pStyle w:val="Compact"/>
-              <w:jc w:val="left"/>
+              <w:jc w:val="center"/>
             </w:pPr>
             <w:r>
               <w:rPr>
@@ -1775,7 +1912,7 @@
           <w:p>
             <w:pPr>
               <w:pStyle w:val="Compact"/>
-              <w:jc w:val="left"/>
+              <w:jc w:val="center"/>
             </w:pPr>
             <w:r>
               <w:rPr>
@@ -1814,7 +1951,7 @@
           <w:p>
             <w:pPr>
               <w:pStyle w:val="Compact"/>
-              <w:jc w:val="left"/>
+              <w:jc w:val="center"/>
             </w:pPr>
             <w:r>
               <w:rPr>
@@ -1837,12 +1974,6 @@
         <w:pStyle w:val="BlockText"/>
       </w:pPr>
       <w:r>
-        <w:t xml:space="preserve">⚠️</w:t>
-      </w:r>
-      <w:r>
-        <w:t xml:space="preserve"> </w:t>
-      </w:r>
-      <w:r>
         <w:rPr>
           <w:rFonts w:hint="eastAsia" w:eastAsia="SimSun" w:ascii="Times New Roman" w:hAnsi="Times New Roman"/>
           <w:b/>
@@ -1875,8 +2006,8 @@
         <w:t xml:space="preserve">倍。这是合成化学中的常用策略。</w:t>
       </w:r>
     </w:p>
-    <w:bookmarkEnd w:id="13"/>
-    <w:bookmarkStart w:id="14" w:name="sn1单分子亲核取代分步经碳正离子"/>
+    <w:bookmarkEnd w:id="16"/>
+    <w:bookmarkStart w:id="17" w:name="sn1单分子亲核取代分步经碳正离子"/>
     <w:p>
       <w:pPr>
         <w:pStyle w:val="Heading3"/>
@@ -2256,7 +2387,7 @@
           <w:p>
             <w:pPr>
               <w:pStyle w:val="Compact"/>
-              <w:jc w:val="left"/>
+              <w:jc w:val="center"/>
             </w:pPr>
             <w:r>
               <w:rPr>
@@ -2272,7 +2403,7 @@
           <w:p>
             <w:pPr>
               <w:pStyle w:val="Compact"/>
-              <w:jc w:val="left"/>
+              <w:jc w:val="center"/>
             </w:pPr>
             <w:r>
               <w:rPr>
@@ -2288,7 +2419,7 @@
           <w:p>
             <w:pPr>
               <w:pStyle w:val="Compact"/>
-              <w:jc w:val="left"/>
+              <w:jc w:val="center"/>
             </w:pPr>
             <w:r>
               <w:rPr>
@@ -2306,7 +2437,7 @@
           <w:p>
             <w:pPr>
               <w:pStyle w:val="Compact"/>
-              <w:jc w:val="left"/>
+              <w:jc w:val="center"/>
             </w:pPr>
             <w:r>
               <w:rPr>
@@ -2321,7 +2452,7 @@
           <w:p>
             <w:pPr>
               <w:pStyle w:val="Compact"/>
-              <w:jc w:val="left"/>
+              <w:jc w:val="center"/>
             </w:pPr>
             <w:r>
               <w:rPr>
@@ -2342,7 +2473,7 @@
           <w:p>
             <w:pPr>
               <w:pStyle w:val="Compact"/>
-              <w:jc w:val="left"/>
+              <w:jc w:val="center"/>
             </w:pPr>
             <w:r>
               <w:rPr>
@@ -2359,7 +2490,7 @@
           <w:p>
             <w:pPr>
               <w:pStyle w:val="Compact"/>
-              <w:jc w:val="left"/>
+              <w:jc w:val="center"/>
             </w:pPr>
             <w:r>
               <w:rPr>
@@ -2374,7 +2505,7 @@
           <w:p>
             <w:pPr>
               <w:pStyle w:val="Compact"/>
-              <w:jc w:val="left"/>
+              <w:jc w:val="center"/>
             </w:pPr>
             <w:r>
               <w:rPr>
@@ -2409,7 +2540,7 @@
           <w:p>
             <w:pPr>
               <w:pStyle w:val="Compact"/>
-              <w:jc w:val="left"/>
+              <w:jc w:val="center"/>
             </w:pPr>
             <w:r>
               <w:rPr>
@@ -2432,7 +2563,7 @@
           <w:p>
             <w:pPr>
               <w:pStyle w:val="Compact"/>
-              <w:jc w:val="left"/>
+              <w:jc w:val="center"/>
             </w:pPr>
             <w:r>
               <w:rPr>
@@ -2447,7 +2578,7 @@
           <w:p>
             <w:pPr>
               <w:pStyle w:val="Compact"/>
-              <w:jc w:val="left"/>
+              <w:jc w:val="center"/>
             </w:pPr>
             <w:r>
               <w:rPr>
@@ -2482,7 +2613,7 @@
           <w:p>
             <w:pPr>
               <w:pStyle w:val="Compact"/>
-              <w:jc w:val="left"/>
+              <w:jc w:val="center"/>
             </w:pPr>
             <w:r>
               <w:rPr>
@@ -2517,7 +2648,7 @@
           <w:p>
             <w:pPr>
               <w:pStyle w:val="Compact"/>
-              <w:jc w:val="left"/>
+              <w:jc w:val="center"/>
             </w:pPr>
             <w:r>
               <w:rPr>
@@ -2532,7 +2663,7 @@
           <w:p>
             <w:pPr>
               <w:pStyle w:val="Compact"/>
-              <w:jc w:val="left"/>
+              <w:jc w:val="center"/>
             </w:pPr>
             <w:r>
               <w:rPr>
@@ -2571,7 +2702,7 @@
           <w:p>
             <w:pPr>
               <w:pStyle w:val="Compact"/>
-              <w:jc w:val="left"/>
+              <w:jc w:val="center"/>
             </w:pPr>
             <w:r>
               <w:rPr>
@@ -2600,7 +2731,7 @@
         <w:pStyle w:val="BlockText"/>
       </w:pPr>
       <w:r>
-        <w:t xml:space="preserve">⚠️ SN1 </w:t>
+        <w:t xml:space="preserve">SN1 </w:t>
       </w:r>
       <w:r>
         <w:rPr>
@@ -2668,8 +2799,8 @@
         <w:t xml:space="preserve">无超共轭/诱导/共振稳定）。</w:t>
       </w:r>
     </w:p>
-    <w:bookmarkEnd w:id="14"/>
-    <w:bookmarkStart w:id="15" w:name="sn1-vs-sn2-全面对比"/>
+    <w:bookmarkEnd w:id="17"/>
+    <w:bookmarkStart w:id="18" w:name="sn1-vs-sn2-全面对比"/>
     <w:p>
       <w:pPr>
         <w:pStyle w:val="Heading3"/>
@@ -2721,7 +2852,7 @@
           <w:p>
             <w:pPr>
               <w:pStyle w:val="Compact"/>
-              <w:jc w:val="left"/>
+              <w:jc w:val="center"/>
             </w:pPr>
             <w:r>
               <w:rPr>
@@ -2737,7 +2868,7 @@
           <w:p>
             <w:pPr>
               <w:pStyle w:val="Compact"/>
-              <w:jc w:val="left"/>
+              <w:jc w:val="center"/>
             </w:pPr>
             <w:r>
               <w:rPr>
@@ -2772,7 +2903,7 @@
           <w:p>
             <w:pPr>
               <w:pStyle w:val="Compact"/>
-              <w:jc w:val="left"/>
+              <w:jc w:val="center"/>
             </w:pPr>
             <w:r>
               <w:rPr>
@@ -2787,7 +2918,7 @@
           <w:p>
             <w:pPr>
               <w:pStyle w:val="Compact"/>
-              <w:jc w:val="left"/>
+              <w:jc w:val="center"/>
             </w:pPr>
             <w:r>
               <w:rPr>
@@ -2821,7 +2952,7 @@
           <w:p>
             <w:pPr>
               <w:pStyle w:val="Compact"/>
-              <w:jc w:val="left"/>
+              <w:jc w:val="center"/>
             </w:pPr>
             <w:r>
               <w:rPr>
@@ -2836,7 +2967,7 @@
           <w:p>
             <w:pPr>
               <w:pStyle w:val="Compact"/>
-              <w:jc w:val="left"/>
+              <w:jc w:val="center"/>
             </w:pPr>
             <w:r>
               <w:rPr>
@@ -2870,7 +3001,7 @@
           <w:p>
             <w:pPr>
               <w:pStyle w:val="Compact"/>
-              <w:jc w:val="left"/>
+              <w:jc w:val="center"/>
             </w:pPr>
             <w:r>
               <w:rPr>
@@ -2885,7 +3016,7 @@
           <w:p>
             <w:pPr>
               <w:pStyle w:val="Compact"/>
-              <w:jc w:val="left"/>
+              <w:jc w:val="center"/>
             </w:pPr>
             <w:r>
               <w:rPr>
@@ -2919,7 +3050,7 @@
           <w:p>
             <w:pPr>
               <w:pStyle w:val="Compact"/>
-              <w:jc w:val="left"/>
+              <w:jc w:val="center"/>
             </w:pPr>
             <w:r>
               <w:rPr>
@@ -2962,7 +3093,7 @@
           <w:p>
             <w:pPr>
               <w:pStyle w:val="Compact"/>
-              <w:jc w:val="left"/>
+              <w:jc w:val="center"/>
             </w:pPr>
             <w:r>
               <w:rPr>
@@ -2996,7 +3127,7 @@
           <w:p>
             <w:pPr>
               <w:pStyle w:val="Compact"/>
-              <w:jc w:val="left"/>
+              <w:jc w:val="center"/>
             </w:pPr>
             <w:r>
               <w:rPr>
@@ -3011,7 +3142,7 @@
           <w:p>
             <w:pPr>
               <w:pStyle w:val="Compact"/>
-              <w:jc w:val="left"/>
+              <w:jc w:val="center"/>
             </w:pPr>
             <w:r>
               <w:rPr>
@@ -3053,7 +3184,7 @@
           <w:p>
             <w:pPr>
               <w:pStyle w:val="Compact"/>
-              <w:jc w:val="left"/>
+              <w:jc w:val="center"/>
             </w:pPr>
             <w:r>
               <w:rPr>
@@ -3068,7 +3199,7 @@
           <w:p>
             <w:pPr>
               <w:pStyle w:val="Compact"/>
-              <w:jc w:val="left"/>
+              <w:jc w:val="center"/>
             </w:pPr>
             <w:r>
               <w:rPr>
@@ -3102,7 +3233,7 @@
           <w:p>
             <w:pPr>
               <w:pStyle w:val="Compact"/>
-              <w:jc w:val="left"/>
+              <w:jc w:val="center"/>
             </w:pPr>
             <w:r>
               <w:rPr>
@@ -3117,7 +3248,7 @@
           <w:p>
             <w:pPr>
               <w:pStyle w:val="Compact"/>
-              <w:jc w:val="left"/>
+              <w:jc w:val="center"/>
             </w:pPr>
             <w:r>
               <w:rPr>
@@ -3151,7 +3282,7 @@
           <w:p>
             <w:pPr>
               <w:pStyle w:val="Compact"/>
-              <w:jc w:val="left"/>
+              <w:jc w:val="center"/>
             </w:pPr>
             <w:r>
               <w:rPr>
@@ -3174,7 +3305,7 @@
           <w:p>
             <w:pPr>
               <w:pStyle w:val="Compact"/>
-              <w:jc w:val="left"/>
+              <w:jc w:val="center"/>
             </w:pPr>
             <w:r>
               <w:rPr>
@@ -3216,7 +3347,7 @@
           <w:p>
             <w:pPr>
               <w:pStyle w:val="Compact"/>
-              <w:jc w:val="left"/>
+              <w:jc w:val="center"/>
             </w:pPr>
             <w:r>
               <w:rPr>
@@ -3231,7 +3362,7 @@
           <w:p>
             <w:pPr>
               <w:pStyle w:val="Compact"/>
-              <w:jc w:val="left"/>
+              <w:jc w:val="center"/>
             </w:pPr>
             <w:r>
               <w:rPr>
@@ -3265,7 +3396,7 @@
           <w:p>
             <w:pPr>
               <w:pStyle w:val="Compact"/>
-              <w:jc w:val="left"/>
+              <w:jc w:val="center"/>
             </w:pPr>
             <w:r>
               <w:rPr>
@@ -3280,7 +3411,7 @@
           <w:p>
             <w:pPr>
               <w:pStyle w:val="Compact"/>
-              <w:jc w:val="left"/>
+              <w:jc w:val="center"/>
             </w:pPr>
             <w:r>
               <w:rPr>
@@ -3292,8 +3423,8 @@
         </w:tc>
       </w:tr>
     </w:tbl>
-    <w:bookmarkEnd w:id="15"/>
-    <w:bookmarkStart w:id="16" w:name="底物结构对-sn1sn2-的反向活性顺序"/>
+    <w:bookmarkEnd w:id="18"/>
+    <w:bookmarkStart w:id="19" w:name="底物结构对-sn1sn2-的反向活性顺序"/>
     <w:p>
       <w:pPr>
         <w:pStyle w:val="Heading3"/>
@@ -3716,9 +3847,9 @@
         </w:pict>
       </w:r>
     </w:p>
-    <w:bookmarkEnd w:id="16"/>
-    <w:bookmarkEnd w:id="17"/>
-    <w:bookmarkStart w:id="22" w:name="三e2-与-e1消除反应的协同与分步"/>
+    <w:bookmarkEnd w:id="19"/>
+    <w:bookmarkEnd w:id="20"/>
+    <w:bookmarkStart w:id="25" w:name="三e2-与-e1消除反应的协同与分步"/>
     <w:p>
       <w:pPr>
         <w:pStyle w:val="Heading2"/>
@@ -3748,7 +3879,7 @@
         <w:t xml:space="preserve">E1：消除反应的协同与分步</w:t>
       </w:r>
     </w:p>
-    <w:bookmarkStart w:id="18" w:name="e2双分子消除一步协同"/>
+    <w:bookmarkStart w:id="21" w:name="e2双分子消除一步协同"/>
     <w:p>
       <w:pPr>
         <w:pStyle w:val="Heading3"/>
@@ -4092,7 +4223,7 @@
           <w:p>
             <w:pPr>
               <w:pStyle w:val="Compact"/>
-              <w:jc w:val="left"/>
+              <w:jc w:val="center"/>
             </w:pPr>
             <w:r>
               <w:rPr>
@@ -4108,7 +4239,7 @@
           <w:p>
             <w:pPr>
               <w:pStyle w:val="Compact"/>
-              <w:jc w:val="left"/>
+              <w:jc w:val="center"/>
             </w:pPr>
             <w:r>
               <w:rPr>
@@ -4126,7 +4257,7 @@
           <w:p>
             <w:pPr>
               <w:pStyle w:val="Compact"/>
-              <w:jc w:val="left"/>
+              <w:jc w:val="center"/>
             </w:pPr>
             <w:r>
               <w:rPr>
@@ -4141,7 +4272,7 @@
           <w:p>
             <w:pPr>
               <w:pStyle w:val="Compact"/>
-              <w:jc w:val="left"/>
+              <w:jc w:val="center"/>
             </w:pPr>
             <w:r>
               <w:rPr>
@@ -4178,7 +4309,7 @@
           <w:p>
             <w:pPr>
               <w:pStyle w:val="Compact"/>
-              <w:jc w:val="left"/>
+              <w:jc w:val="center"/>
             </w:pPr>
             <w:r>
               <w:rPr>
@@ -4193,7 +4324,7 @@
           <w:p>
             <w:pPr>
               <w:pStyle w:val="Compact"/>
-              <w:jc w:val="left"/>
+              <w:jc w:val="center"/>
             </w:pPr>
             <w:r>
               <w:rPr>
@@ -4222,7 +4353,7 @@
           <w:p>
             <w:pPr>
               <w:pStyle w:val="Compact"/>
-              <w:jc w:val="left"/>
+              <w:jc w:val="center"/>
             </w:pPr>
             <w:r>
               <w:rPr>
@@ -4237,7 +4368,7 @@
           <w:p>
             <w:pPr>
               <w:pStyle w:val="Compact"/>
-              <w:jc w:val="left"/>
+              <w:jc w:val="center"/>
             </w:pPr>
             <w:r>
               <w:rPr>
@@ -4254,7 +4385,7 @@
           <w:p>
             <w:pPr>
               <w:pStyle w:val="Compact"/>
-              <w:jc w:val="left"/>
+              <w:jc w:val="center"/>
             </w:pPr>
             <w:r>
               <w:rPr>
@@ -4269,7 +4400,7 @@
           <w:p>
             <w:pPr>
               <w:pStyle w:val="Compact"/>
-              <w:jc w:val="left"/>
+              <w:jc w:val="center"/>
             </w:pPr>
             <w:r>
               <w:rPr>
@@ -4436,8 +4567,8 @@
         <w:t xml:space="preserve">更易接近）</w:t>
       </w:r>
     </w:p>
-    <w:bookmarkEnd w:id="18"/>
-    <w:bookmarkStart w:id="19" w:name="e1单分子消除分步经碳正离子"/>
+    <w:bookmarkEnd w:id="21"/>
+    <w:bookmarkStart w:id="22" w:name="e1单分子消除分步经碳正离子"/>
     <w:p>
       <w:pPr>
         <w:pStyle w:val="Heading3"/>
@@ -4731,8 +4862,8 @@
         <w:t xml:space="preserve">高温</w:t>
       </w:r>
     </w:p>
-    <w:bookmarkEnd w:id="19"/>
-    <w:bookmarkStart w:id="20" w:name="e2-vs-e1-全面对比"/>
+    <w:bookmarkEnd w:id="22"/>
+    <w:bookmarkStart w:id="23" w:name="e2-vs-e1-全面对比"/>
     <w:p>
       <w:pPr>
         <w:pStyle w:val="Heading3"/>
@@ -4783,7 +4914,7 @@
           <w:p>
             <w:pPr>
               <w:pStyle w:val="Compact"/>
-              <w:jc w:val="left"/>
+              <w:jc w:val="center"/>
             </w:pPr>
             <w:r>
               <w:rPr>
@@ -4799,7 +4930,7 @@
           <w:p>
             <w:pPr>
               <w:pStyle w:val="Compact"/>
-              <w:jc w:val="left"/>
+              <w:jc w:val="center"/>
             </w:pPr>
             <w:r>
               <w:rPr>
@@ -4834,7 +4965,7 @@
           <w:p>
             <w:pPr>
               <w:pStyle w:val="Compact"/>
-              <w:jc w:val="left"/>
+              <w:jc w:val="center"/>
             </w:pPr>
             <w:r>
               <w:rPr>
@@ -4849,7 +4980,7 @@
           <w:p>
             <w:pPr>
               <w:pStyle w:val="Compact"/>
-              <w:jc w:val="left"/>
+              <w:jc w:val="center"/>
             </w:pPr>
             <w:r>
               <w:rPr>
@@ -4883,7 +5014,7 @@
           <w:p>
             <w:pPr>
               <w:pStyle w:val="Compact"/>
-              <w:jc w:val="left"/>
+              <w:jc w:val="center"/>
             </w:pPr>
             <w:r>
               <w:rPr>
@@ -4898,7 +5029,7 @@
           <w:p>
             <w:pPr>
               <w:pStyle w:val="Compact"/>
-              <w:jc w:val="left"/>
+              <w:jc w:val="center"/>
             </w:pPr>
             <w:r>
               <w:rPr>
@@ -4932,7 +5063,7 @@
           <w:p>
             <w:pPr>
               <w:pStyle w:val="Compact"/>
-              <w:jc w:val="left"/>
+              <w:jc w:val="center"/>
             </w:pPr>
             <w:r>
               <w:rPr>
@@ -4947,7 +5078,7 @@
           <w:p>
             <w:pPr>
               <w:pStyle w:val="Compact"/>
-              <w:jc w:val="left"/>
+              <w:jc w:val="center"/>
             </w:pPr>
             <w:r>
               <w:rPr>
@@ -4981,7 +5112,7 @@
           <w:p>
             <w:pPr>
               <w:pStyle w:val="Compact"/>
-              <w:jc w:val="left"/>
+              <w:jc w:val="center"/>
             </w:pPr>
             <w:r>
               <w:rPr>
@@ -5006,7 +5137,7 @@
           <w:p>
             <w:pPr>
               <w:pStyle w:val="Compact"/>
-              <w:jc w:val="left"/>
+              <w:jc w:val="center"/>
             </w:pPr>
             <w:r>
               <w:rPr>
@@ -5040,7 +5171,7 @@
           <w:p>
             <w:pPr>
               <w:pStyle w:val="Compact"/>
-              <w:jc w:val="left"/>
+              <w:jc w:val="center"/>
             </w:pPr>
             <w:r>
               <w:rPr>
@@ -5055,7 +5186,7 @@
           <w:p>
             <w:pPr>
               <w:pStyle w:val="Compact"/>
-              <w:jc w:val="left"/>
+              <w:jc w:val="center"/>
             </w:pPr>
             <w:r>
               <w:rPr>
@@ -5091,7 +5222,7 @@
           <w:p>
             <w:pPr>
               <w:pStyle w:val="Compact"/>
-              <w:jc w:val="left"/>
+              <w:jc w:val="center"/>
             </w:pPr>
             <w:r>
               <w:rPr>
@@ -5114,7 +5245,7 @@
           <w:p>
             <w:pPr>
               <w:pStyle w:val="Compact"/>
-              <w:jc w:val="left"/>
+              <w:jc w:val="center"/>
             </w:pPr>
             <w:r>
               <w:rPr>
@@ -5148,7 +5279,7 @@
           <w:p>
             <w:pPr>
               <w:pStyle w:val="Compact"/>
-              <w:jc w:val="left"/>
+              <w:jc w:val="center"/>
             </w:pPr>
             <w:r>
               <w:rPr>
@@ -5181,7 +5312,7 @@
           <w:p>
             <w:pPr>
               <w:pStyle w:val="Compact"/>
-              <w:jc w:val="left"/>
+              <w:jc w:val="center"/>
             </w:pPr>
             <w:r>
               <w:rPr>
@@ -5215,7 +5346,7 @@
           <w:p>
             <w:pPr>
               <w:pStyle w:val="Compact"/>
-              <w:jc w:val="left"/>
+              <w:jc w:val="center"/>
             </w:pPr>
             <w:r>
               <w:rPr>
@@ -5236,7 +5367,7 @@
           <w:p>
             <w:pPr>
               <w:pStyle w:val="Compact"/>
-              <w:jc w:val="left"/>
+              <w:jc w:val="center"/>
             </w:pPr>
             <w:r>
               <w:rPr>
@@ -5276,7 +5407,7 @@
           <w:p>
             <w:pPr>
               <w:pStyle w:val="Compact"/>
-              <w:jc w:val="left"/>
+              <w:jc w:val="center"/>
             </w:pPr>
             <w:r>
               <w:rPr>
@@ -5291,7 +5422,7 @@
           <w:p>
             <w:pPr>
               <w:pStyle w:val="Compact"/>
-              <w:jc w:val="left"/>
+              <w:jc w:val="center"/>
             </w:pPr>
             <w:r>
               <w:rPr>
@@ -5303,8 +5434,8 @@
         </w:tc>
       </w:tr>
     </w:tbl>
-    <w:bookmarkEnd w:id="20"/>
-    <w:bookmarkStart w:id="21" w:name="e2-的立体化学核心反式共平面"/>
+    <w:bookmarkEnd w:id="23"/>
+    <w:bookmarkStart w:id="24" w:name="e2-的立体化学核心反式共平面"/>
     <w:p>
       <w:pPr>
         <w:pStyle w:val="Heading3"/>
@@ -5501,7 +5632,7 @@
           <w:p>
             <w:pPr>
               <w:pStyle w:val="Compact"/>
-              <w:jc w:val="left"/>
+              <w:jc w:val="center"/>
             </w:pPr>
             <w:r>
               <w:rPr>
@@ -5612,7 +5743,7 @@
           <w:p>
             <w:pPr>
               <w:pStyle w:val="Compact"/>
-              <w:jc w:val="left"/>
+              <w:jc w:val="center"/>
             </w:pPr>
             <w:r>
               <w:rPr>
@@ -5688,7 +5819,7 @@
           <w:p>
             <w:pPr>
               <w:pStyle w:val="Compact"/>
-              <w:jc w:val="left"/>
+              <w:jc w:val="center"/>
             </w:pPr>
             <w:r>
               <w:rPr>
@@ -5762,7 +5893,7 @@
           <w:p>
             <w:pPr>
               <w:pStyle w:val="Compact"/>
-              <w:jc w:val="left"/>
+              <w:jc w:val="center"/>
             </w:pPr>
             <w:r>
               <w:rPr>
@@ -5836,7 +5967,7 @@
           <w:p>
             <w:pPr>
               <w:pStyle w:val="Compact"/>
-              <w:jc w:val="left"/>
+              <w:jc w:val="center"/>
             </w:pPr>
             <w:r>
               <w:rPr>
@@ -5972,9 +6103,9 @@
         </w:pict>
       </w:r>
     </w:p>
-    <w:bookmarkEnd w:id="21"/>
-    <w:bookmarkEnd w:id="22"/>
-    <w:bookmarkStart w:id="26" w:name="四sn1e1-竞争-vs-sn2e2-竞争"/>
+    <w:bookmarkEnd w:id="24"/>
+    <w:bookmarkEnd w:id="25"/>
+    <w:bookmarkStart w:id="29" w:name="四sn1e1-竞争-vs-sn2e2-竞争"/>
     <w:p>
       <w:pPr>
         <w:pStyle w:val="Heading2"/>
@@ -6004,7 +6135,7 @@
         <w:t xml:space="preserve">竞争</w:t>
       </w:r>
     </w:p>
-    <w:bookmarkStart w:id="23" w:name="sn1e1-共享碳正离子一个中间体两个命运"/>
+    <w:bookmarkStart w:id="26" w:name="sn1e1-共享碳正离子一个中间体两个命运"/>
     <w:p>
       <w:pPr>
         <w:pStyle w:val="Heading3"/>
@@ -6199,7 +6330,7 @@
           <w:p>
             <w:pPr>
               <w:pStyle w:val="Compact"/>
-              <w:jc w:val="left"/>
+              <w:jc w:val="center"/>
             </w:pPr>
             <w:r>
               <w:rPr>
@@ -6215,7 +6346,7 @@
           <w:p>
             <w:pPr>
               <w:pStyle w:val="Compact"/>
-              <w:jc w:val="left"/>
+              <w:jc w:val="center"/>
             </w:pPr>
             <w:r>
               <w:rPr>
@@ -6238,7 +6369,7 @@
           <w:p>
             <w:pPr>
               <w:pStyle w:val="Compact"/>
-              <w:jc w:val="left"/>
+              <w:jc w:val="center"/>
             </w:pPr>
             <w:r>
               <w:rPr>
@@ -6263,7 +6394,7 @@
           <w:p>
             <w:pPr>
               <w:pStyle w:val="Compact"/>
-              <w:jc w:val="left"/>
+              <w:jc w:val="center"/>
             </w:pPr>
             <w:r>
               <w:rPr>
@@ -6278,7 +6409,7 @@
           <w:p>
             <w:pPr>
               <w:pStyle w:val="Compact"/>
-              <w:jc w:val="left"/>
+              <w:jc w:val="center"/>
             </w:pPr>
             <w:r>
               <w:rPr>
@@ -6293,7 +6424,7 @@
           <w:p>
             <w:pPr>
               <w:pStyle w:val="Compact"/>
-              <w:jc w:val="left"/>
+              <w:jc w:val="center"/>
             </w:pPr>
             <w:r>
               <w:rPr>
@@ -6330,7 +6461,7 @@
           <w:p>
             <w:pPr>
               <w:pStyle w:val="Compact"/>
-              <w:jc w:val="left"/>
+              <w:jc w:val="center"/>
             </w:pPr>
             <w:r>
               <w:rPr>
@@ -6345,7 +6476,7 @@
           <w:p>
             <w:pPr>
               <w:pStyle w:val="Compact"/>
-              <w:jc w:val="left"/>
+              <w:jc w:val="center"/>
             </w:pPr>
             <w:r>
               <w:rPr>
@@ -6366,7 +6497,7 @@
           <w:p>
             <w:pPr>
               <w:pStyle w:val="Compact"/>
-              <w:jc w:val="left"/>
+              <w:jc w:val="center"/>
             </w:pPr>
             <w:r>
               <w:rPr>
@@ -6389,7 +6520,7 @@
           <w:p>
             <w:pPr>
               <w:pStyle w:val="Compact"/>
-              <w:jc w:val="left"/>
+              <w:jc w:val="center"/>
             </w:pPr>
             <w:r>
               <w:rPr>
@@ -6410,7 +6541,7 @@
           <w:p>
             <w:pPr>
               <w:pStyle w:val="Compact"/>
-              <w:jc w:val="left"/>
+              <w:jc w:val="center"/>
             </w:pPr>
             <w:r>
               <w:rPr>
@@ -6431,7 +6562,7 @@
           <w:p>
             <w:pPr>
               <w:pStyle w:val="Compact"/>
-              <w:jc w:val="left"/>
+              <w:jc w:val="center"/>
             </w:pPr>
             <w:r>
               <w:rPr>
@@ -6454,7 +6585,7 @@
           <w:p>
             <w:pPr>
               <w:pStyle w:val="Compact"/>
-              <w:jc w:val="left"/>
+              <w:jc w:val="center"/>
             </w:pPr>
             <w:r>
               <w:rPr>
@@ -6469,7 +6600,7 @@
           <w:p>
             <w:pPr>
               <w:pStyle w:val="Compact"/>
-              <w:jc w:val="left"/>
+              <w:jc w:val="center"/>
             </w:pPr>
             <w:r>
               <w:rPr>
@@ -6484,7 +6615,7 @@
           <w:p>
             <w:pPr>
               <w:pStyle w:val="Compact"/>
-              <w:jc w:val="left"/>
+              <w:jc w:val="center"/>
             </w:pPr>
             <w:r>
               <w:rPr>
@@ -6569,8 +6700,8 @@
         <w:t xml:space="preserve">为主（低温留取代）</w:t>
       </w:r>
     </w:p>
-    <w:bookmarkEnd w:id="23"/>
-    <w:bookmarkStart w:id="24" w:name="sn2e2-竞争的四个控制因子"/>
+    <w:bookmarkEnd w:id="26"/>
+    <w:bookmarkStart w:id="27" w:name="sn2e2-竞争的四个控制因子"/>
     <w:p>
       <w:pPr>
         <w:pStyle w:val="Heading3"/>
@@ -7160,8 +7291,8 @@
         <w:t xml:space="preserve">差异）</w:t>
       </w:r>
     </w:p>
-    <w:bookmarkEnd w:id="24"/>
-    <w:bookmarkStart w:id="25" w:name="试剂分类速查表"/>
+    <w:bookmarkEnd w:id="27"/>
+    <w:bookmarkStart w:id="28" w:name="试剂分类速查表"/>
     <w:p>
       <w:pPr>
         <w:pStyle w:val="Heading3"/>
@@ -7197,7 +7328,7 @@
           <w:p>
             <w:pPr>
               <w:pStyle w:val="Compact"/>
-              <w:jc w:val="left"/>
+              <w:jc w:val="center"/>
             </w:pPr>
             <w:r>
               <w:rPr>
@@ -7245,7 +7376,7 @@
           <w:p>
             <w:pPr>
               <w:pStyle w:val="Compact"/>
-              <w:jc w:val="left"/>
+              <w:jc w:val="center"/>
             </w:pPr>
             <w:r>
               <w:rPr>
@@ -7263,7 +7394,7 @@
           <w:p>
             <w:pPr>
               <w:pStyle w:val="Compact"/>
-              <w:jc w:val="left"/>
+              <w:jc w:val="center"/>
             </w:pPr>
             <w:r>
               <w:rPr>
@@ -7308,7 +7439,7 @@
           <w:p>
             <w:pPr>
               <w:pStyle w:val="Compact"/>
-              <w:jc w:val="left"/>
+              <w:jc w:val="center"/>
             </w:pPr>
             <w:r>
               <w:rPr>
@@ -7325,7 +7456,7 @@
           <w:p>
             <w:pPr>
               <w:pStyle w:val="Compact"/>
-              <w:jc w:val="left"/>
+              <w:jc w:val="center"/>
             </w:pPr>
             <w:r>
               <w:rPr>
@@ -7370,7 +7501,7 @@
           <w:p>
             <w:pPr>
               <w:pStyle w:val="Compact"/>
-              <w:jc w:val="left"/>
+              <w:jc w:val="center"/>
             </w:pPr>
             <w:r>
               <w:rPr>
@@ -7387,7 +7518,7 @@
           <w:p>
             <w:pPr>
               <w:pStyle w:val="Compact"/>
-              <w:jc w:val="left"/>
+              <w:jc w:val="center"/>
             </w:pPr>
             <w:r>
               <w:rPr>
@@ -7432,7 +7563,7 @@
           <w:p>
             <w:pPr>
               <w:pStyle w:val="Compact"/>
-              <w:jc w:val="left"/>
+              <w:jc w:val="center"/>
             </w:pPr>
             <w:r>
               <w:rPr>
@@ -7449,7 +7580,7 @@
           <w:p>
             <w:pPr>
               <w:pStyle w:val="Compact"/>
-              <w:jc w:val="left"/>
+              <w:jc w:val="center"/>
             </w:pPr>
             <w:r>
               <w:rPr>
@@ -7494,7 +7625,7 @@
           <w:p>
             <w:pPr>
               <w:pStyle w:val="Compact"/>
-              <w:jc w:val="left"/>
+              <w:jc w:val="center"/>
             </w:pPr>
             <w:r>
               <w:rPr>
@@ -7517,7 +7648,7 @@
           <w:p>
             <w:pPr>
               <w:pStyle w:val="Compact"/>
-              <w:jc w:val="left"/>
+              <w:jc w:val="center"/>
             </w:pPr>
             <w:r>
               <w:rPr>
@@ -7562,7 +7693,7 @@
           <w:p>
             <w:pPr>
               <w:pStyle w:val="Compact"/>
-              <w:jc w:val="left"/>
+              <w:jc w:val="center"/>
             </w:pPr>
             <w:r>
               <w:rPr>
@@ -7587,7 +7718,7 @@
           <w:p>
             <w:pPr>
               <w:pStyle w:val="Compact"/>
-              <w:jc w:val="left"/>
+              <w:jc w:val="center"/>
             </w:pPr>
             <w:r>
               <w:rPr>
@@ -7632,7 +7763,7 @@
           <w:p>
             <w:pPr>
               <w:pStyle w:val="Compact"/>
-              <w:jc w:val="left"/>
+              <w:jc w:val="center"/>
             </w:pPr>
             <w:r>
               <w:rPr>
@@ -7657,7 +7788,7 @@
           <w:p>
             <w:pPr>
               <w:pStyle w:val="Compact"/>
-              <w:jc w:val="left"/>
+              <w:jc w:val="center"/>
             </w:pPr>
             <w:r>
               <w:rPr>
@@ -7702,7 +7833,7 @@
           <w:p>
             <w:pPr>
               <w:pStyle w:val="Compact"/>
-              <w:jc w:val="left"/>
+              <w:jc w:val="center"/>
             </w:pPr>
             <w:r>
               <w:rPr>
@@ -7721,9 +7852,9 @@
         </w:pict>
       </w:r>
     </w:p>
-    <w:bookmarkEnd w:id="25"/>
-    <w:bookmarkEnd w:id="26"/>
-    <w:bookmarkStart w:id="27" w:name="五二级底物真正的竞争主战场"/>
+    <w:bookmarkEnd w:id="28"/>
+    <w:bookmarkEnd w:id="29"/>
+    <w:bookmarkStart w:id="30" w:name="五二级底物真正的竞争主战场"/>
     <w:p>
       <w:pPr>
         <w:pStyle w:val="Heading2"/>
@@ -7866,7 +7997,7 @@
           <w:p>
             <w:pPr>
               <w:pStyle w:val="Compact"/>
-              <w:jc w:val="left"/>
+              <w:jc w:val="center"/>
             </w:pPr>
             <w:r>
               <w:rPr>
@@ -7882,7 +8013,7 @@
           <w:p>
             <w:pPr>
               <w:pStyle w:val="Compact"/>
-              <w:jc w:val="left"/>
+              <w:jc w:val="center"/>
             </w:pPr>
             <w:r>
               <w:rPr>
@@ -7900,7 +8031,7 @@
           <w:p>
             <w:pPr>
               <w:pStyle w:val="Compact"/>
-              <w:jc w:val="left"/>
+              <w:jc w:val="center"/>
             </w:pPr>
             <w:r>
               <w:rPr>
@@ -7915,7 +8046,7 @@
           <w:p>
             <w:pPr>
               <w:pStyle w:val="Compact"/>
-              <w:jc w:val="left"/>
+              <w:jc w:val="center"/>
             </w:pPr>
             <w:r>
               <w:rPr>
@@ -7964,7 +8095,7 @@
           <w:p>
             <w:pPr>
               <w:pStyle w:val="Compact"/>
-              <w:jc w:val="left"/>
+              <w:jc w:val="center"/>
             </w:pPr>
             <w:r>
               <w:rPr>
@@ -7979,7 +8110,7 @@
           <w:p>
             <w:pPr>
               <w:pStyle w:val="Compact"/>
-              <w:jc w:val="left"/>
+              <w:jc w:val="center"/>
             </w:pPr>
             <w:r>
               <w:rPr>
@@ -8016,7 +8147,7 @@
           <w:p>
             <w:pPr>
               <w:pStyle w:val="Compact"/>
-              <w:jc w:val="left"/>
+              <w:jc w:val="center"/>
             </w:pPr>
             <w:r>
               <w:rPr>
@@ -8031,7 +8162,7 @@
           <w:p>
             <w:pPr>
               <w:pStyle w:val="Compact"/>
-              <w:jc w:val="left"/>
+              <w:jc w:val="center"/>
             </w:pPr>
             <w:r>
               <w:rPr>
@@ -8086,7 +8217,7 @@
           <w:p>
             <w:pPr>
               <w:pStyle w:val="Compact"/>
-              <w:jc w:val="left"/>
+              <w:jc w:val="center"/>
             </w:pPr>
             <w:r>
               <w:rPr>
@@ -8101,7 +8232,7 @@
           <w:p>
             <w:pPr>
               <w:pStyle w:val="Compact"/>
-              <w:jc w:val="left"/>
+              <w:jc w:val="center"/>
             </w:pPr>
             <w:r>
               <w:rPr>
@@ -8136,7 +8267,7 @@
           <w:p>
             <w:pPr>
               <w:pStyle w:val="Compact"/>
-              <w:jc w:val="left"/>
+              <w:jc w:val="center"/>
             </w:pPr>
             <w:r>
               <w:rPr>
@@ -8151,7 +8282,7 @@
           <w:p>
             <w:pPr>
               <w:pStyle w:val="Compact"/>
-              <w:jc w:val="left"/>
+              <w:jc w:val="center"/>
             </w:pPr>
             <w:r>
               <w:rPr>
@@ -8176,12 +8307,6 @@
         <w:pStyle w:val="BlockText"/>
       </w:pPr>
       <w:r>
-        <w:t xml:space="preserve">💡</w:t>
-      </w:r>
-      <w:r>
-        <w:t xml:space="preserve"> </w:t>
-      </w:r>
-      <w:r>
         <w:rPr>
           <w:rFonts w:hint="eastAsia" w:eastAsia="SimSun" w:ascii="Times New Roman" w:hAnsi="Times New Roman"/>
           <w:b/>
@@ -8239,8 +8364,8 @@
         </w:pict>
       </w:r>
     </w:p>
-    <w:bookmarkEnd w:id="27"/>
-    <w:bookmarkStart w:id="30" w:name="六邻基参与与重排伪例外的识别"/>
+    <w:bookmarkEnd w:id="30"/>
+    <w:bookmarkStart w:id="33" w:name="六邻基参与与重排伪例外的识别"/>
     <w:p>
       <w:pPr>
         <w:pStyle w:val="Heading2"/>
@@ -8264,7 +8389,7 @@
         <w:t xml:space="preserve">的识别</w:t>
       </w:r>
     </w:p>
-    <w:bookmarkStart w:id="28" w:name="邻基参与ngp"/>
+    <w:bookmarkStart w:id="31" w:name="邻基参与ngp"/>
     <w:p>
       <w:pPr>
         <w:pStyle w:val="Heading3"/>
@@ -8459,7 +8584,7 @@
           <w:p>
             <w:pPr>
               <w:pStyle w:val="Compact"/>
-              <w:jc w:val="left"/>
+              <w:jc w:val="center"/>
             </w:pPr>
             <w:r>
               <w:rPr>
@@ -8475,7 +8600,7 @@
           <w:p>
             <w:pPr>
               <w:pStyle w:val="Compact"/>
-              <w:jc w:val="left"/>
+              <w:jc w:val="center"/>
             </w:pPr>
             <w:r>
               <w:rPr>
@@ -8491,7 +8616,7 @@
           <w:p>
             <w:pPr>
               <w:pStyle w:val="Compact"/>
-              <w:jc w:val="left"/>
+              <w:jc w:val="center"/>
             </w:pPr>
             <w:r>
               <w:rPr>
@@ -8509,7 +8634,7 @@
           <w:p>
             <w:pPr>
               <w:pStyle w:val="Compact"/>
-              <w:jc w:val="left"/>
+              <w:jc w:val="center"/>
             </w:pPr>
             <w:r>
               <w:rPr>
@@ -8536,7 +8661,7 @@
           <w:p>
             <w:pPr>
               <w:pStyle w:val="Compact"/>
-              <w:jc w:val="left"/>
+              <w:jc w:val="center"/>
             </w:pPr>
             <w:r>
               <w:rPr>
@@ -8551,7 +8676,7 @@
           <w:p>
             <w:pPr>
               <w:pStyle w:val="Compact"/>
-              <w:jc w:val="left"/>
+              <w:jc w:val="center"/>
             </w:pPr>
             <w:r>
               <w:rPr>
@@ -8598,7 +8723,7 @@
           <w:p>
             <w:pPr>
               <w:pStyle w:val="Compact"/>
-              <w:jc w:val="left"/>
+              <w:jc w:val="center"/>
             </w:pPr>
             <w:r>
               <w:rPr>
@@ -8613,7 +8738,7 @@
           <w:p>
             <w:pPr>
               <w:pStyle w:val="Compact"/>
-              <w:jc w:val="left"/>
+              <w:jc w:val="center"/>
             </w:pPr>
             <w:r>
               <w:rPr>
@@ -8628,7 +8753,7 @@
           <w:p>
             <w:pPr>
               <w:pStyle w:val="Compact"/>
-              <w:jc w:val="left"/>
+              <w:jc w:val="center"/>
             </w:pPr>
             <w:r>
               <w:rPr>
@@ -8663,12 +8788,6 @@
         <w:pStyle w:val="BlockText"/>
       </w:pPr>
       <w:r>
-        <w:t xml:space="preserve">⚠️</w:t>
-      </w:r>
-      <w:r>
-        <w:t xml:space="preserve"> </w:t>
-      </w:r>
-      <w:r>
         <w:rPr>
           <w:rFonts w:hint="eastAsia" w:eastAsia="SimSun" w:ascii="Times New Roman" w:hAnsi="Times New Roman"/>
           <w:b/>
@@ -8712,8 +8831,8 @@
         <w:t xml:space="preserve">。</w:t>
       </w:r>
     </w:p>
-    <w:bookmarkEnd w:id="28"/>
-    <w:bookmarkStart w:id="29" w:name="碳正离子重排"/>
+    <w:bookmarkEnd w:id="31"/>
+    <w:bookmarkStart w:id="32" w:name="碳正离子重排"/>
     <w:p>
       <w:pPr>
         <w:pStyle w:val="Heading3"/>
@@ -8957,9 +9076,6 @@
       <w:pPr>
         <w:pStyle w:val="BlockText"/>
       </w:pPr>
-      <w:r>
-        <w:t xml:space="preserve">⚠️ </w:t>
-      </w:r>
       <w:r>
         <w:rPr>
           <w:rFonts w:hint="eastAsia" w:eastAsia="SimSun" w:ascii="Times New Roman" w:hAnsi="Times New Roman"/>
@@ -8983,9 +9099,9 @@
         </w:pict>
       </w:r>
     </w:p>
-    <w:bookmarkEnd w:id="29"/>
-    <w:bookmarkEnd w:id="30"/>
-    <w:bookmarkStart w:id="37" w:name="七典型例题"/>
+    <w:bookmarkEnd w:id="32"/>
+    <w:bookmarkEnd w:id="33"/>
+    <w:bookmarkStart w:id="40" w:name="七典型例题"/>
     <w:p>
       <w:pPr>
         <w:pStyle w:val="Heading2"/>
@@ -8997,7 +9113,7 @@
         <w:t xml:space="preserve">七、典型例题</w:t>
       </w:r>
     </w:p>
-    <w:bookmarkStart w:id="31" w:name="例1-sn1sn2-底物活性排序"/>
+    <w:bookmarkStart w:id="34" w:name="例1-sn1sn2-底物活性排序"/>
     <w:p>
       <w:pPr>
         <w:pStyle w:val="Heading3"/>
@@ -9263,8 +9379,8 @@
         </w:pict>
       </w:r>
     </w:p>
-    <w:bookmarkEnd w:id="31"/>
-    <w:bookmarkStart w:id="32" w:name="例2-sn2-立体化学walden-翻转"/>
+    <w:bookmarkEnd w:id="34"/>
+    <w:bookmarkStart w:id="35" w:name="例2-sn2-立体化学walden-翻转"/>
     <w:p>
       <w:pPr>
         <w:pStyle w:val="Heading3"/>
@@ -9701,8 +9817,8 @@
         </w:pict>
       </w:r>
     </w:p>
-    <w:bookmarkEnd w:id="32"/>
-    <w:bookmarkStart w:id="33" w:name="例3-e2-区域选择性zaitsev-vs-hofmann"/>
+    <w:bookmarkEnd w:id="35"/>
+    <w:bookmarkStart w:id="36" w:name="例3-e2-区域选择性zaitsev-vs-hofmann"/>
     <w:p>
       <w:pPr>
         <w:pStyle w:val="Heading3"/>
@@ -10174,8 +10290,8 @@
         </w:pict>
       </w:r>
     </w:p>
-    <w:bookmarkEnd w:id="33"/>
-    <w:bookmarkStart w:id="34" w:name="例4-环己烷-e2-构象分析"/>
+    <w:bookmarkEnd w:id="36"/>
+    <w:bookmarkStart w:id="37" w:name="例4-环己烷-e2-构象分析"/>
     <w:p>
       <w:pPr>
         <w:pStyle w:val="Heading3"/>
@@ -10844,8 +10960,8 @@
         </w:pict>
       </w:r>
     </w:p>
-    <w:bookmarkEnd w:id="34"/>
-    <w:bookmarkStart w:id="35" w:name="例5-二级底物竞争判断"/>
+    <w:bookmarkEnd w:id="37"/>
+    <w:bookmarkStart w:id="38" w:name="例5-二级底物竞争判断"/>
     <w:p>
       <w:pPr>
         <w:pStyle w:val="Heading3"/>
@@ -11573,8 +11689,8 @@
         </w:pict>
       </w:r>
     </w:p>
-    <w:bookmarkEnd w:id="35"/>
-    <w:bookmarkStart w:id="36" w:name="例6-综合竞争产物反推机理"/>
+    <w:bookmarkEnd w:id="38"/>
+    <w:bookmarkStart w:id="39" w:name="例6-综合竞争产物反推机理"/>
     <w:p>
       <w:pPr>
         <w:pStyle w:val="Heading3"/>
@@ -12211,9 +12327,9 @@
         </w:pict>
       </w:r>
     </w:p>
-    <w:bookmarkEnd w:id="36"/>
-    <w:bookmarkEnd w:id="37"/>
-    <w:bookmarkStart w:id="38" w:name="八常见误区"/>
+    <w:bookmarkEnd w:id="39"/>
+    <w:bookmarkEnd w:id="40"/>
+    <w:bookmarkStart w:id="41" w:name="八常见误区"/>
     <w:p>
       <w:pPr>
         <w:pStyle w:val="Heading2"/>
@@ -13013,8 +13129,8 @@
         </w:pict>
       </w:r>
     </w:p>
-    <w:bookmarkEnd w:id="38"/>
-    <w:bookmarkStart w:id="39" w:name="九方法总结sne-竞争判断决策树"/>
+    <w:bookmarkEnd w:id="41"/>
+    <w:bookmarkStart w:id="42" w:name="九方法总结sne-竞争判断决策树"/>
     <w:p>
       <w:pPr>
         <w:pStyle w:val="Heading2"/>
@@ -13915,8 +14031,8 @@
         </w:pict>
       </w:r>
     </w:p>
-    <w:bookmarkEnd w:id="39"/>
-    <w:bookmarkStart w:id="43" w:name="十核心速查卡"/>
+    <w:bookmarkEnd w:id="42"/>
+    <w:bookmarkStart w:id="46" w:name="十核心速查卡"/>
     <w:p>
       <w:pPr>
         <w:pStyle w:val="Heading2"/>
@@ -13928,7 +14044,7 @@
         <w:t xml:space="preserve">十、核心速查卡</w:t>
       </w:r>
     </w:p>
-    <w:bookmarkStart w:id="40" w:name="sn1sn2e1e2-速查总表"/>
+    <w:bookmarkStart w:id="43" w:name="sn1sn2e1e2-速查总表"/>
     <w:p>
       <w:pPr>
         <w:pStyle w:val="Heading3"/>
@@ -13965,7 +14081,7 @@
           <w:p>
             <w:pPr>
               <w:pStyle w:val="Compact"/>
-              <w:jc w:val="left"/>
+              <w:jc w:val="center"/>
             </w:pPr>
             <w:r>
               <w:rPr>
@@ -13981,7 +14097,7 @@
           <w:p>
             <w:pPr>
               <w:pStyle w:val="Compact"/>
-              <w:jc w:val="left"/>
+              <w:jc w:val="center"/>
             </w:pPr>
             <w:r>
               <w:rPr>
@@ -13997,7 +14113,7 @@
           <w:p>
             <w:pPr>
               <w:pStyle w:val="Compact"/>
-              <w:jc w:val="left"/>
+              <w:jc w:val="center"/>
             </w:pPr>
             <w:r>
               <w:rPr>
@@ -14013,7 +14129,7 @@
           <w:p>
             <w:pPr>
               <w:pStyle w:val="Compact"/>
-              <w:jc w:val="left"/>
+              <w:jc w:val="center"/>
             </w:pPr>
             <w:r>
               <w:rPr>
@@ -14029,7 +14145,7 @@
           <w:p>
             <w:pPr>
               <w:pStyle w:val="Compact"/>
-              <w:jc w:val="left"/>
+              <w:jc w:val="center"/>
             </w:pPr>
             <w:r>
               <w:rPr>
@@ -14047,7 +14163,7 @@
           <w:p>
             <w:pPr>
               <w:pStyle w:val="Compact"/>
-              <w:jc w:val="left"/>
+              <w:jc w:val="center"/>
             </w:pPr>
             <w:r>
               <w:rPr>
@@ -14064,7 +14180,7 @@
           <w:p>
             <w:pPr>
               <w:pStyle w:val="Compact"/>
-              <w:jc w:val="left"/>
+              <w:jc w:val="center"/>
             </w:pPr>
             <w:r>
               <w:rPr>
@@ -14079,7 +14195,7 @@
           <w:p>
             <w:pPr>
               <w:pStyle w:val="Compact"/>
-              <w:jc w:val="left"/>
+              <w:jc w:val="center"/>
             </w:pPr>
             <w:r>
               <w:rPr>
@@ -14094,7 +14210,7 @@
           <w:p>
             <w:pPr>
               <w:pStyle w:val="Compact"/>
-              <w:jc w:val="left"/>
+              <w:jc w:val="center"/>
             </w:pPr>
             <w:r>
               <w:rPr>
@@ -14109,7 +14225,7 @@
           <w:p>
             <w:pPr>
               <w:pStyle w:val="Compact"/>
-              <w:jc w:val="left"/>
+              <w:jc w:val="center"/>
             </w:pPr>
             <w:r>
               <w:rPr>
@@ -14126,7 +14242,7 @@
           <w:p>
             <w:pPr>
               <w:pStyle w:val="Compact"/>
-              <w:jc w:val="left"/>
+              <w:jc w:val="center"/>
             </w:pPr>
             <w:r>
               <w:rPr>
@@ -14143,7 +14259,7 @@
           <w:p>
             <w:pPr>
               <w:pStyle w:val="Compact"/>
-              <w:jc w:val="left"/>
+              <w:jc w:val="center"/>
             </w:pPr>
             <w:r>
               <w:rPr>
@@ -14158,7 +14274,7 @@
           <w:p>
             <w:pPr>
               <w:pStyle w:val="Compact"/>
-              <w:jc w:val="left"/>
+              <w:jc w:val="center"/>
             </w:pPr>
             <w:r>
               <w:rPr>
@@ -14173,7 +14289,7 @@
           <w:p>
             <w:pPr>
               <w:pStyle w:val="Compact"/>
-              <w:jc w:val="left"/>
+              <w:jc w:val="center"/>
             </w:pPr>
             <w:r>
               <w:rPr>
@@ -14188,7 +14304,7 @@
           <w:p>
             <w:pPr>
               <w:pStyle w:val="Compact"/>
-              <w:jc w:val="left"/>
+              <w:jc w:val="center"/>
             </w:pPr>
             <w:r>
               <w:rPr>
@@ -14205,7 +14321,7 @@
           <w:p>
             <w:pPr>
               <w:pStyle w:val="Compact"/>
-              <w:jc w:val="left"/>
+              <w:jc w:val="center"/>
             </w:pPr>
             <w:r>
               <w:rPr>
@@ -14222,7 +14338,7 @@
           <w:p>
             <w:pPr>
               <w:pStyle w:val="Compact"/>
-              <w:jc w:val="left"/>
+              <w:jc w:val="center"/>
             </w:pPr>
             <w:r>
               <w:rPr>
@@ -14237,7 +14353,7 @@
           <w:p>
             <w:pPr>
               <w:pStyle w:val="Compact"/>
-              <w:jc w:val="left"/>
+              <w:jc w:val="center"/>
             </w:pPr>
             <w:r>
               <w:rPr>
@@ -14252,7 +14368,7 @@
           <w:p>
             <w:pPr>
               <w:pStyle w:val="Compact"/>
-              <w:jc w:val="left"/>
+              <w:jc w:val="center"/>
             </w:pPr>
             <w:r>
               <w:rPr>
@@ -14267,7 +14383,7 @@
           <w:p>
             <w:pPr>
               <w:pStyle w:val="Compact"/>
-              <w:jc w:val="left"/>
+              <w:jc w:val="center"/>
             </w:pPr>
             <w:r>
               <w:rPr>
@@ -14284,7 +14400,7 @@
           <w:p>
             <w:pPr>
               <w:pStyle w:val="Compact"/>
-              <w:jc w:val="left"/>
+              <w:jc w:val="center"/>
             </w:pPr>
             <w:r>
               <w:rPr>
@@ -14301,7 +14417,7 @@
           <w:p>
             <w:pPr>
               <w:pStyle w:val="Compact"/>
-              <w:jc w:val="left"/>
+              <w:jc w:val="center"/>
             </w:pPr>
             <w:r>
               <w:rPr>
@@ -14316,7 +14432,7 @@
           <w:p>
             <w:pPr>
               <w:pStyle w:val="Compact"/>
-              <w:jc w:val="left"/>
+              <w:jc w:val="center"/>
             </w:pPr>
             <w:r>
               <w:rPr>
@@ -14331,7 +14447,7 @@
           <w:p>
             <w:pPr>
               <w:pStyle w:val="Compact"/>
-              <w:jc w:val="left"/>
+              <w:jc w:val="center"/>
             </w:pPr>
             <w:r>
               <w:rPr>
@@ -14346,7 +14462,7 @@
           <w:p>
             <w:pPr>
               <w:pStyle w:val="Compact"/>
-              <w:jc w:val="left"/>
+              <w:jc w:val="center"/>
             </w:pPr>
             <w:r>
               <w:rPr>
@@ -14363,7 +14479,7 @@
           <w:p>
             <w:pPr>
               <w:pStyle w:val="Compact"/>
-              <w:jc w:val="left"/>
+              <w:jc w:val="center"/>
             </w:pPr>
             <w:r>
               <w:rPr>
@@ -14380,7 +14496,7 @@
           <w:p>
             <w:pPr>
               <w:pStyle w:val="Compact"/>
-              <w:jc w:val="left"/>
+              <w:jc w:val="center"/>
             </w:pPr>
             <w:r>
               <w:rPr>
@@ -14395,7 +14511,7 @@
           <w:p>
             <w:pPr>
               <w:pStyle w:val="Compact"/>
-              <w:jc w:val="left"/>
+              <w:jc w:val="center"/>
             </w:pPr>
             <w:r>
               <w:rPr>
@@ -14410,7 +14526,7 @@
           <w:p>
             <w:pPr>
               <w:pStyle w:val="Compact"/>
-              <w:jc w:val="left"/>
+              <w:jc w:val="center"/>
             </w:pPr>
             <w:r>
               <w:rPr>
@@ -14425,7 +14541,7 @@
           <w:p>
             <w:pPr>
               <w:pStyle w:val="Compact"/>
-              <w:jc w:val="left"/>
+              <w:jc w:val="center"/>
             </w:pPr>
             <w:r>
               <w:rPr>
@@ -14442,7 +14558,7 @@
           <w:p>
             <w:pPr>
               <w:pStyle w:val="Compact"/>
-              <w:jc w:val="left"/>
+              <w:jc w:val="center"/>
             </w:pPr>
             <w:r>
               <w:rPr>
@@ -14459,7 +14575,7 @@
           <w:p>
             <w:pPr>
               <w:pStyle w:val="Compact"/>
-              <w:jc w:val="left"/>
+              <w:jc w:val="center"/>
             </w:pPr>
             <w:r>
               <w:rPr>
@@ -14474,7 +14590,7 @@
           <w:p>
             <w:pPr>
               <w:pStyle w:val="Compact"/>
-              <w:jc w:val="left"/>
+              <w:jc w:val="center"/>
             </w:pPr>
             <w:r>
               <w:rPr>
@@ -14489,7 +14605,7 @@
           <w:p>
             <w:pPr>
               <w:pStyle w:val="Compact"/>
-              <w:jc w:val="left"/>
+              <w:jc w:val="center"/>
             </w:pPr>
             <w:r>
               <w:rPr>
@@ -14504,7 +14620,7 @@
           <w:p>
             <w:pPr>
               <w:pStyle w:val="Compact"/>
-              <w:jc w:val="left"/>
+              <w:jc w:val="center"/>
             </w:pPr>
             <w:r>
               <w:rPr>
@@ -14521,7 +14637,7 @@
           <w:p>
             <w:pPr>
               <w:pStyle w:val="Compact"/>
-              <w:jc w:val="left"/>
+              <w:jc w:val="center"/>
             </w:pPr>
             <w:r>
               <w:rPr>
@@ -14538,7 +14654,7 @@
           <w:p>
             <w:pPr>
               <w:pStyle w:val="Compact"/>
-              <w:jc w:val="left"/>
+              <w:jc w:val="center"/>
             </w:pPr>
             <w:r>
               <w:rPr>
@@ -14553,7 +14669,7 @@
           <w:p>
             <w:pPr>
               <w:pStyle w:val="Compact"/>
-              <w:jc w:val="left"/>
+              <w:jc w:val="center"/>
             </w:pPr>
             <w:r>
               <w:rPr>
@@ -14568,7 +14684,7 @@
           <w:p>
             <w:pPr>
               <w:pStyle w:val="Compact"/>
-              <w:jc w:val="left"/>
+              <w:jc w:val="center"/>
             </w:pPr>
             <w:r>
               <w:rPr>
@@ -14583,7 +14699,7 @@
           <w:p>
             <w:pPr>
               <w:pStyle w:val="Compact"/>
-              <w:jc w:val="left"/>
+              <w:jc w:val="center"/>
             </w:pPr>
             <w:r>
               <w:rPr>
@@ -14600,7 +14716,7 @@
           <w:p>
             <w:pPr>
               <w:pStyle w:val="Compact"/>
-              <w:jc w:val="left"/>
+              <w:jc w:val="center"/>
             </w:pPr>
             <w:r>
               <w:rPr>
@@ -14617,7 +14733,7 @@
           <w:p>
             <w:pPr>
               <w:pStyle w:val="Compact"/>
-              <w:jc w:val="left"/>
+              <w:jc w:val="center"/>
             </w:pPr>
             <w:r>
               <w:rPr>
@@ -14638,7 +14754,7 @@
           <w:p>
             <w:pPr>
               <w:pStyle w:val="Compact"/>
-              <w:jc w:val="left"/>
+              <w:jc w:val="center"/>
             </w:pPr>
             <w:r>
               <w:rPr>
@@ -14653,7 +14769,7 @@
           <w:p>
             <w:pPr>
               <w:pStyle w:val="Compact"/>
-              <w:jc w:val="left"/>
+              <w:jc w:val="center"/>
             </w:pPr>
             <w:r>
               <w:rPr>
@@ -14668,7 +14784,7 @@
           <w:p>
             <w:pPr>
               <w:pStyle w:val="Compact"/>
-              <w:jc w:val="left"/>
+              <w:jc w:val="center"/>
             </w:pPr>
             <w:r>
               <w:rPr>
@@ -14685,7 +14801,7 @@
           <w:p>
             <w:pPr>
               <w:pStyle w:val="Compact"/>
-              <w:jc w:val="left"/>
+              <w:jc w:val="center"/>
             </w:pPr>
             <w:r>
               <w:rPr>
@@ -14702,7 +14818,7 @@
           <w:p>
             <w:pPr>
               <w:pStyle w:val="Compact"/>
-              <w:jc w:val="left"/>
+              <w:jc w:val="center"/>
             </w:pPr>
             <w:r>
               <w:rPr>
@@ -14717,7 +14833,7 @@
           <w:p>
             <w:pPr>
               <w:pStyle w:val="Compact"/>
-              <w:jc w:val="left"/>
+              <w:jc w:val="center"/>
             </w:pPr>
             <w:r>
               <w:rPr>
@@ -14732,7 +14848,7 @@
           <w:p>
             <w:pPr>
               <w:pStyle w:val="Compact"/>
-              <w:jc w:val="left"/>
+              <w:jc w:val="center"/>
             </w:pPr>
             <w:r>
               <w:rPr>
@@ -14747,7 +14863,7 @@
           <w:p>
             <w:pPr>
               <w:pStyle w:val="Compact"/>
-              <w:jc w:val="left"/>
+              <w:jc w:val="center"/>
             </w:pPr>
             <w:r>
               <w:rPr>
@@ -14764,7 +14880,7 @@
           <w:p>
             <w:pPr>
               <w:pStyle w:val="Compact"/>
-              <w:jc w:val="left"/>
+              <w:jc w:val="center"/>
             </w:pPr>
             <w:r>
               <w:rPr>
@@ -14781,7 +14897,7 @@
           <w:p>
             <w:pPr>
               <w:pStyle w:val="Compact"/>
-              <w:jc w:val="left"/>
+              <w:jc w:val="center"/>
             </w:pPr>
             <w:r>
               <w:rPr>
@@ -14796,7 +14912,7 @@
           <w:p>
             <w:pPr>
               <w:pStyle w:val="Compact"/>
-              <w:jc w:val="left"/>
+              <w:jc w:val="center"/>
             </w:pPr>
             <w:r>
               <w:rPr>
@@ -14811,7 +14927,7 @@
           <w:p>
             <w:pPr>
               <w:pStyle w:val="Compact"/>
-              <w:jc w:val="left"/>
+              <w:jc w:val="center"/>
             </w:pPr>
             <w:r>
               <w:rPr>
@@ -14826,7 +14942,7 @@
           <w:p>
             <w:pPr>
               <w:pStyle w:val="Compact"/>
-              <w:jc w:val="left"/>
+              <w:jc w:val="center"/>
             </w:pPr>
             <w:r>
               <w:rPr>
@@ -14838,8 +14954,8 @@
         </w:tc>
       </w:tr>
     </w:tbl>
-    <w:bookmarkEnd w:id="40"/>
-    <w:bookmarkStart w:id="41" w:name="常见试剂分类卡"/>
+    <w:bookmarkEnd w:id="43"/>
+    <w:bookmarkStart w:id="44" w:name="常见试剂分类卡"/>
     <w:p>
       <w:pPr>
         <w:pStyle w:val="Heading3"/>
@@ -14873,7 +14989,7 @@
           <w:p>
             <w:pPr>
               <w:pStyle w:val="Compact"/>
-              <w:jc w:val="left"/>
+              <w:jc w:val="center"/>
             </w:pPr>
             <w:r>
               <w:rPr>
@@ -14937,7 +15053,7 @@
           <w:p>
             <w:pPr>
               <w:pStyle w:val="Compact"/>
-              <w:jc w:val="left"/>
+              <w:jc w:val="center"/>
             </w:pPr>
             <w:r>
               <w:rPr>
@@ -14955,7 +15071,7 @@
           <w:p>
             <w:pPr>
               <w:pStyle w:val="Compact"/>
-              <w:jc w:val="left"/>
+              <w:jc w:val="center"/>
             </w:pPr>
             <w:r>
               <w:rPr>
@@ -15015,7 +15131,7 @@
           <w:p>
             <w:pPr>
               <w:pStyle w:val="Compact"/>
-              <w:jc w:val="left"/>
+              <w:jc w:val="center"/>
             </w:pPr>
             <w:r>
               <w:rPr>
@@ -15032,7 +15148,7 @@
           <w:p>
             <w:pPr>
               <w:pStyle w:val="Compact"/>
-              <w:jc w:val="left"/>
+              <w:jc w:val="center"/>
             </w:pPr>
             <w:r>
               <w:rPr>
@@ -15092,7 +15208,7 @@
           <w:p>
             <w:pPr>
               <w:pStyle w:val="Compact"/>
-              <w:jc w:val="left"/>
+              <w:jc w:val="center"/>
             </w:pPr>
             <w:r>
               <w:rPr>
@@ -15109,7 +15225,7 @@
           <w:p>
             <w:pPr>
               <w:pStyle w:val="Compact"/>
-              <w:jc w:val="left"/>
+              <w:jc w:val="center"/>
             </w:pPr>
             <w:r>
               <w:rPr>
@@ -15169,7 +15285,7 @@
           <w:p>
             <w:pPr>
               <w:pStyle w:val="Compact"/>
-              <w:jc w:val="left"/>
+              <w:jc w:val="center"/>
             </w:pPr>
             <w:r>
               <w:rPr>
@@ -15186,7 +15302,7 @@
           <w:p>
             <w:pPr>
               <w:pStyle w:val="Compact"/>
-              <w:jc w:val="left"/>
+              <w:jc w:val="center"/>
             </w:pPr>
             <w:r>
               <w:rPr>
@@ -15246,7 +15362,7 @@
           <w:p>
             <w:pPr>
               <w:pStyle w:val="Compact"/>
-              <w:jc w:val="left"/>
+              <w:jc w:val="center"/>
             </w:pPr>
             <w:r>
               <w:rPr>
@@ -15263,7 +15379,7 @@
           <w:p>
             <w:pPr>
               <w:pStyle w:val="Compact"/>
-              <w:jc w:val="left"/>
+              <w:jc w:val="center"/>
             </w:pPr>
             <w:r>
               <w:rPr>
@@ -15323,7 +15439,7 @@
           <w:p>
             <w:pPr>
               <w:pStyle w:val="Compact"/>
-              <w:jc w:val="left"/>
+              <w:jc w:val="center"/>
             </w:pPr>
             <w:r>
               <w:rPr>
@@ -15346,7 +15462,7 @@
           <w:p>
             <w:pPr>
               <w:pStyle w:val="Compact"/>
-              <w:jc w:val="left"/>
+              <w:jc w:val="center"/>
             </w:pPr>
             <w:r>
               <w:rPr>
@@ -15406,7 +15522,7 @@
           <w:p>
             <w:pPr>
               <w:pStyle w:val="Compact"/>
-              <w:jc w:val="left"/>
+              <w:jc w:val="center"/>
             </w:pPr>
             <w:r>
               <w:rPr>
@@ -15429,7 +15545,7 @@
           <w:p>
             <w:pPr>
               <w:pStyle w:val="Compact"/>
-              <w:jc w:val="left"/>
+              <w:jc w:val="center"/>
             </w:pPr>
             <w:r>
               <w:rPr>
@@ -15489,7 +15605,7 @@
           <w:p>
             <w:pPr>
               <w:pStyle w:val="Compact"/>
-              <w:jc w:val="left"/>
+              <w:jc w:val="center"/>
             </w:pPr>
             <w:r>
               <w:rPr>
@@ -15506,7 +15622,7 @@
           <w:p>
             <w:pPr>
               <w:pStyle w:val="Compact"/>
-              <w:jc w:val="left"/>
+              <w:jc w:val="center"/>
             </w:pPr>
             <w:r>
               <w:rPr>
@@ -15566,7 +15682,7 @@
           <w:p>
             <w:pPr>
               <w:pStyle w:val="Compact"/>
-              <w:jc w:val="left"/>
+              <w:jc w:val="center"/>
             </w:pPr>
             <w:r>
               <w:rPr>
@@ -15583,7 +15699,7 @@
           <w:p>
             <w:pPr>
               <w:pStyle w:val="Compact"/>
-              <w:jc w:val="left"/>
+              <w:jc w:val="center"/>
             </w:pPr>
             <w:r>
               <w:rPr>
@@ -15643,7 +15759,7 @@
           <w:p>
             <w:pPr>
               <w:pStyle w:val="Compact"/>
-              <w:jc w:val="left"/>
+              <w:jc w:val="center"/>
             </w:pPr>
             <w:r>
               <w:rPr>
@@ -15655,8 +15771,8 @@
         </w:tc>
       </w:tr>
     </w:tbl>
-    <w:bookmarkEnd w:id="41"/>
-    <w:bookmarkStart w:id="42" w:name="环己烷-e2-构象分析卡"/>
+    <w:bookmarkEnd w:id="44"/>
+    <w:bookmarkStart w:id="45" w:name="环己烷-e2-构象分析卡"/>
     <w:p>
       <w:pPr>
         <w:pStyle w:val="Heading3"/>
@@ -15698,7 +15814,7 @@
           <w:p>
             <w:pPr>
               <w:pStyle w:val="Compact"/>
-              <w:jc w:val="left"/>
+              <w:jc w:val="center"/>
             </w:pPr>
             <w:r>
               <w:rPr>
@@ -15760,7 +15876,7 @@
           <w:p>
             <w:pPr>
               <w:pStyle w:val="Compact"/>
-              <w:jc w:val="left"/>
+              <w:jc w:val="center"/>
             </w:pPr>
             <w:r>
               <w:rPr>
@@ -15785,7 +15901,7 @@
           <w:p>
             <w:pPr>
               <w:pStyle w:val="Compact"/>
-              <w:jc w:val="left"/>
+              <w:jc w:val="center"/>
             </w:pPr>
             <w:r>
               <w:rPr>
@@ -15848,7 +15964,7 @@
           <w:p>
             <w:pPr>
               <w:pStyle w:val="Compact"/>
-              <w:jc w:val="left"/>
+              <w:jc w:val="center"/>
             </w:pPr>
             <w:r>
               <w:rPr>
@@ -15871,7 +15987,7 @@
           <w:p>
             <w:pPr>
               <w:pStyle w:val="Compact"/>
-              <w:jc w:val="left"/>
+              <w:jc w:val="center"/>
             </w:pPr>
             <w:r>
               <w:rPr>
@@ -15934,7 +16050,7 @@
           <w:p>
             <w:pPr>
               <w:pStyle w:val="Compact"/>
-              <w:jc w:val="left"/>
+              <w:jc w:val="center"/>
             </w:pPr>
             <w:r>
               <w:rPr>
@@ -15957,7 +16073,7 @@
           <w:p>
             <w:pPr>
               <w:pStyle w:val="Compact"/>
-              <w:jc w:val="left"/>
+              <w:jc w:val="center"/>
             </w:pPr>
             <w:r>
               <w:rPr>
@@ -16020,7 +16136,7 @@
           <w:p>
             <w:pPr>
               <w:pStyle w:val="Compact"/>
-              <w:jc w:val="left"/>
+              <w:jc w:val="center"/>
             </w:pPr>
             <w:r>
               <w:rPr>
@@ -16043,7 +16159,7 @@
           <w:p>
             <w:pPr>
               <w:pStyle w:val="Compact"/>
-              <w:jc w:val="left"/>
+              <w:jc w:val="center"/>
             </w:pPr>
             <w:r>
               <w:rPr>
@@ -16088,7 +16204,7 @@
           <w:p>
             <w:pPr>
               <w:pStyle w:val="Compact"/>
-              <w:jc w:val="left"/>
+              <w:jc w:val="center"/>
             </w:pPr>
             <w:r>
               <w:rPr>
@@ -16107,9 +16223,9 @@
         </w:pict>
       </w:r>
     </w:p>
-    <w:bookmarkEnd w:id="42"/>
-    <w:bookmarkEnd w:id="43"/>
-    <w:bookmarkStart w:id="47" w:name="十一练习题"/>
+    <w:bookmarkEnd w:id="45"/>
+    <w:bookmarkEnd w:id="46"/>
+    <w:bookmarkStart w:id="50" w:name="十一练习题"/>
     <w:p>
       <w:pPr>
         <w:pStyle w:val="Heading2"/>
@@ -16121,7 +16237,7 @@
         <w:t xml:space="preserve">十一、练习题</w:t>
       </w:r>
     </w:p>
-    <w:bookmarkStart w:id="44" w:name="基础巩固"/>
+    <w:bookmarkStart w:id="47" w:name="基础巩固"/>
     <w:p>
       <w:pPr>
         <w:pStyle w:val="Heading3"/>
@@ -16256,8 +16372,8 @@
         <w:t xml:space="preserve">反应。”</w:t>
       </w:r>
     </w:p>
-    <w:bookmarkEnd w:id="44"/>
-    <w:bookmarkStart w:id="45" w:name="提高训练"/>
+    <w:bookmarkEnd w:id="47"/>
+    <w:bookmarkStart w:id="48" w:name="提高训练"/>
     <w:p>
       <w:pPr>
         <w:pStyle w:val="Heading3"/>
@@ -16477,8 +16593,8 @@
         <w:t xml:space="preserve">中。</w:t>
       </w:r>
     </w:p>
-    <w:bookmarkEnd w:id="45"/>
-    <w:bookmarkStart w:id="46" w:name="挑战"/>
+    <w:bookmarkEnd w:id="48"/>
+    <w:bookmarkStart w:id="49" w:name="挑战"/>
     <w:p>
       <w:pPr>
         <w:pStyle w:val="Heading3"/>
@@ -16667,9 +16783,9 @@
         </w:pict>
       </w:r>
     </w:p>
-    <w:bookmarkEnd w:id="46"/>
-    <w:bookmarkEnd w:id="47"/>
-    <w:bookmarkStart w:id="48" w:name="参考答案"/>
+    <w:bookmarkEnd w:id="49"/>
+    <w:bookmarkEnd w:id="50"/>
+    <w:bookmarkStart w:id="51" w:name="参考答案"/>
     <w:p>
       <w:pPr>
         <w:pStyle w:val="Heading2"/>
@@ -17302,8 +17418,8 @@
         </w:pict>
       </w:r>
     </w:p>
-    <w:bookmarkEnd w:id="48"/>
-    <w:bookmarkStart w:id="49" w:name="十二跨专题连接"/>
+    <w:bookmarkEnd w:id="51"/>
+    <w:bookmarkStart w:id="52" w:name="十二跨专题连接"/>
     <w:p>
       <w:pPr>
         <w:pStyle w:val="Heading2"/>
@@ -17496,8 +17612,8 @@
         </w:pict>
       </w:r>
     </w:p>
-    <w:bookmarkEnd w:id="49"/>
-    <w:bookmarkEnd w:id="50"/>
+    <w:bookmarkEnd w:id="52"/>
+    <w:bookmarkEnd w:id="53"/>
     <w:sectPr>
       <w:footerReference w:type="default" r:id="rId9"/>
       <w:footnotePr>

</xml_diff>